<commit_message>
Publish Purpose and Use Memo and Pilot One-Pager; link protocol v0.5 references to public copy
</commit_message>
<xml_diff>
--- a/docs/protocol/files/20261017_O1_Pilot-Design-Report_v0.5.docx
+++ b/docs/protocol/files/20261017_O1_Pilot-Design-Report_v0.5.docx
@@ -26889,7 +26889,7 @@
           <w:sz w:val="17"/>
           <w:szCs w:val="17"/>
         </w:rPr>
-        <w:t xml:space="preserve">Metagov, Purpose and Use Memo: Blockchain for Impact Funding Evidence Map (final draft, October 2026). Internal document held in the project Google Drive.</w:t>
+        <w:t xml:space="preserve">Metagov, Purpose and Use Memo: Blockchain for Impact Funding Evidence Map (final draft, October 2026). Public: https://github.com/mikemetagov/bfi-evidence-map-pilot/blob/main/docs/outputs/01_Design/gsr_purpose_and_pilot_summary/20261009_Purpose-and-Use-Memo_final-draft.pdf</w:t>
       </w:r>
     </w:p>
     <w:p>
@@ -28146,7 +28146,7 @@
           <w:sz w:val="16"/>
           <w:szCs w:val="16"/>
         </w:rPr>
-        <w:t xml:space="preserve">Metagov, Purpose and Use Memo: Blockchain for Impact Funding Evidence Map (final draft, October 2026). Internal document held in the project Google Drive.</w:t>
+        <w:t xml:space="preserve">Metagov, Purpose and Use Memo: Blockchain for Impact Funding Evidence Map (final draft, October 2026). Public: https://github.com/mikemetagov/bfi-evidence-map-pilot/blob/main/docs/outputs/01_Design/gsr_purpose_and_pilot_summary/20261009_Purpose-and-Use-Memo_final-draft.pdf</w:t>
       </w:r>
     </w:p>
   </w:footnote>
@@ -28222,7 +28222,7 @@
           <w:sz w:val="16"/>
           <w:szCs w:val="16"/>
         </w:rPr>
-        <w:t xml:space="preserve">Metagov, Purpose and Use Memo: Blockchain for Impact Funding Evidence Map (final draft, October 2026). Internal document held in the project Google Drive.</w:t>
+        <w:t xml:space="preserve">Metagov, Purpose and Use Memo: Blockchain for Impact Funding Evidence Map (final draft, October 2026). Public: https://github.com/mikemetagov/bfi-evidence-map-pilot/blob/main/docs/outputs/01_Design/gsr_purpose_and_pilot_summary/20261009_Purpose-and-Use-Memo_final-draft.pdf</w:t>
       </w:r>
     </w:p>
   </w:footnote>
@@ -28240,7 +28240,7 @@
           <w:sz w:val="16"/>
           <w:szCs w:val="16"/>
         </w:rPr>
-        <w:t xml:space="preserve">Metagov, Purpose and Use Memo: Blockchain for Impact Funding Evidence Map (final draft, October 2026). Internal document held in the project Google Drive.</w:t>
+        <w:t xml:space="preserve">Metagov, Purpose and Use Memo: Blockchain for Impact Funding Evidence Map (final draft, October 2026). Public: https://github.com/mikemetagov/bfi-evidence-map-pilot/blob/main/docs/outputs/01_Design/gsr_purpose_and_pilot_summary/20261009_Purpose-and-Use-Memo_final-draft.pdf</w:t>
       </w:r>
     </w:p>
   </w:footnote>
@@ -28606,7 +28606,7 @@
           <w:sz w:val="16"/>
           <w:szCs w:val="16"/>
         </w:rPr>
-        <w:t xml:space="preserve">Metagov, Purpose and Use Memo: Blockchain for Impact Funding Evidence Map (final draft, October 2026). Internal document held in the project Google Drive.</w:t>
+        <w:t xml:space="preserve">Metagov, Purpose and Use Memo: Blockchain for Impact Funding Evidence Map (final draft, October 2026). Public: https://github.com/mikemetagov/bfi-evidence-map-pilot/blob/main/docs/outputs/01_Design/gsr_purpose_and_pilot_summary/20261009_Purpose-and-Use-Memo_final-draft.pdf</w:t>
       </w:r>
     </w:p>
   </w:footnote>
@@ -28856,7 +28856,7 @@
           <w:sz w:val="16"/>
           <w:szCs w:val="16"/>
         </w:rPr>
-        <w:t xml:space="preserve">Metagov, Purpose and Use Memo: Blockchain for Impact Funding Evidence Map (final draft, October 2026). Internal document held in the project Google Drive.</w:t>
+        <w:t xml:space="preserve">Metagov, Purpose and Use Memo: Blockchain for Impact Funding Evidence Map (final draft, October 2026). Public: https://github.com/mikemetagov/bfi-evidence-map-pilot/blob/main/docs/outputs/01_Design/gsr_purpose_and_pilot_summary/20261009_Purpose-and-Use-Memo_final-draft.pdf</w:t>
       </w:r>
     </w:p>
   </w:footnote>
@@ -28874,7 +28874,7 @@
           <w:sz w:val="16"/>
           <w:szCs w:val="16"/>
         </w:rPr>
-        <w:t xml:space="preserve">Metagov, Purpose and Use Memo: Blockchain for Impact Funding Evidence Map (final draft, October 2026). Internal document held in the project Google Drive.</w:t>
+        <w:t xml:space="preserve">Metagov, Purpose and Use Memo: Blockchain for Impact Funding Evidence Map (final draft, October 2026). Public: https://github.com/mikemetagov/bfi-evidence-map-pilot/blob/main/docs/outputs/01_Design/gsr_purpose_and_pilot_summary/20261009_Purpose-and-Use-Memo_final-draft.pdf</w:t>
       </w:r>
     </w:p>
   </w:footnote>
@@ -28892,7 +28892,7 @@
           <w:sz w:val="16"/>
           <w:szCs w:val="16"/>
         </w:rPr>
-        <w:t xml:space="preserve">Metagov, Purpose and Use Memo: Blockchain for Impact Funding Evidence Map (final draft, October 2026). Internal document held in the project Google Drive.</w:t>
+        <w:t xml:space="preserve">Metagov, Purpose and Use Memo: Blockchain for Impact Funding Evidence Map (final draft, October 2026). Public: https://github.com/mikemetagov/bfi-evidence-map-pilot/blob/main/docs/outputs/01_Design/gsr_purpose_and_pilot_summary/20261009_Purpose-and-Use-Memo_final-draft.pdf</w:t>
       </w:r>
     </w:p>
   </w:footnote>
@@ -29229,7 +29229,7 @@
           <w:sz w:val="16"/>
           <w:szCs w:val="16"/>
         </w:rPr>
-        <w:t xml:space="preserve">Metagov, Purpose and Use Memo: Blockchain for Impact Funding Evidence Map (final draft, October 2026). Internal document held in the project Google Drive.</w:t>
+        <w:t xml:space="preserve">Metagov, Purpose and Use Memo: Blockchain for Impact Funding Evidence Map (final draft, October 2026). Public: https://github.com/mikemetagov/bfi-evidence-map-pilot/blob/main/docs/outputs/01_Design/gsr_purpose_and_pilot_summary/20261009_Purpose-and-Use-Memo_final-draft.pdf</w:t>
       </w:r>
     </w:p>
   </w:footnote>
@@ -29276,7 +29276,7 @@
           <w:sz w:val="16"/>
           <w:szCs w:val="16"/>
         </w:rPr>
-        <w:t xml:space="preserve">Metagov, Purpose and Use Memo: Blockchain for Impact Funding Evidence Map (final draft, October 2026). Internal document held in the project Google Drive.</w:t>
+        <w:t xml:space="preserve">Metagov, Purpose and Use Memo: Blockchain for Impact Funding Evidence Map (final draft, October 2026). Public: https://github.com/mikemetagov/bfi-evidence-map-pilot/blob/main/docs/outputs/01_Design/gsr_purpose_and_pilot_summary/20261009_Purpose-and-Use-Memo_final-draft.pdf</w:t>
       </w:r>
     </w:p>
   </w:footnote>
@@ -29294,7 +29294,7 @@
           <w:sz w:val="16"/>
           <w:szCs w:val="16"/>
         </w:rPr>
-        <w:t xml:space="preserve">Metagov, Purpose and Use Memo: Blockchain for Impact Funding Evidence Map (final draft, October 2026). Internal document held in the project Google Drive.</w:t>
+        <w:t xml:space="preserve">Metagov, Purpose and Use Memo: Blockchain for Impact Funding Evidence Map (final draft, October 2026). Public: https://github.com/mikemetagov/bfi-evidence-map-pilot/blob/main/docs/outputs/01_Design/gsr_purpose_and_pilot_summary/20261009_Purpose-and-Use-Memo_final-draft.pdf</w:t>
       </w:r>
     </w:p>
   </w:footnote>
@@ -29312,7 +29312,7 @@
           <w:sz w:val="16"/>
           <w:szCs w:val="16"/>
         </w:rPr>
-        <w:t xml:space="preserve">Metagov, Purpose and Use Memo: Blockchain for Impact Funding Evidence Map (final draft, October 2026). Internal document held in the project Google Drive.</w:t>
+        <w:t xml:space="preserve">Metagov, Purpose and Use Memo: Blockchain for Impact Funding Evidence Map (final draft, October 2026). Public: https://github.com/mikemetagov/bfi-evidence-map-pilot/blob/main/docs/outputs/01_Design/gsr_purpose_and_pilot_summary/20261009_Purpose-and-Use-Memo_final-draft.pdf</w:t>
       </w:r>
     </w:p>
   </w:footnote>
@@ -29533,7 +29533,7 @@
           <w:sz w:val="16"/>
           <w:szCs w:val="16"/>
         </w:rPr>
-        <w:t xml:space="preserve">Metagov, Purpose and Use Memo: Blockchain for Impact Funding Evidence Map (final draft, October 2026). Internal document held in the project Google Drive.</w:t>
+        <w:t xml:space="preserve">Metagov, Purpose and Use Memo: Blockchain for Impact Funding Evidence Map (final draft, October 2026). Public: https://github.com/mikemetagov/bfi-evidence-map-pilot/blob/main/docs/outputs/01_Design/gsr_purpose_and_pilot_summary/20261009_Purpose-and-Use-Memo_final-draft.pdf</w:t>
       </w:r>
     </w:p>
   </w:footnote>
@@ -29609,7 +29609,7 @@
           <w:sz w:val="16"/>
           <w:szCs w:val="16"/>
         </w:rPr>
-        <w:t xml:space="preserve">Metagov, Purpose and Use Memo: Blockchain for Impact Funding Evidence Map (final draft, October 2026). Internal document held in the project Google Drive.</w:t>
+        <w:t xml:space="preserve">Metagov, Purpose and Use Memo: Blockchain for Impact Funding Evidence Map (final draft, October 2026). Public: https://github.com/mikemetagov/bfi-evidence-map-pilot/blob/main/docs/outputs/01_Design/gsr_purpose_and_pilot_summary/20261009_Purpose-and-Use-Memo_final-draft.pdf</w:t>
       </w:r>
     </w:p>
   </w:footnote>
@@ -29627,7 +29627,7 @@
           <w:sz w:val="16"/>
           <w:szCs w:val="16"/>
         </w:rPr>
-        <w:t xml:space="preserve">Metagov, Purpose and Use Memo: Blockchain for Impact Funding Evidence Map (final draft, October 2026). Internal document held in the project Google Drive.</w:t>
+        <w:t xml:space="preserve">Metagov, Purpose and Use Memo: Blockchain for Impact Funding Evidence Map (final draft, October 2026). Public: https://github.com/mikemetagov/bfi-evidence-map-pilot/blob/main/docs/outputs/01_Design/gsr_purpose_and_pilot_summary/20261009_Purpose-and-Use-Memo_final-draft.pdf</w:t>
       </w:r>
     </w:p>
   </w:footnote>
@@ -29645,7 +29645,7 @@
           <w:sz w:val="16"/>
           <w:szCs w:val="16"/>
         </w:rPr>
-        <w:t xml:space="preserve">Metagov, Purpose and Use Memo: Blockchain for Impact Funding Evidence Map (final draft, October 2026). Internal document held in the project Google Drive.</w:t>
+        <w:t xml:space="preserve">Metagov, Purpose and Use Memo: Blockchain for Impact Funding Evidence Map (final draft, October 2026). Public: https://github.com/mikemetagov/bfi-evidence-map-pilot/blob/main/docs/outputs/01_Design/gsr_purpose_and_pilot_summary/20261009_Purpose-and-Use-Memo_final-draft.pdf</w:t>
       </w:r>
     </w:p>
   </w:footnote>
@@ -29663,7 +29663,7 @@
           <w:sz w:val="16"/>
           <w:szCs w:val="16"/>
         </w:rPr>
-        <w:t xml:space="preserve">Metagov, Purpose and Use Memo: Blockchain for Impact Funding Evidence Map (final draft, October 2026). Internal document held in the project Google Drive.</w:t>
+        <w:t xml:space="preserve">Metagov, Purpose and Use Memo: Blockchain for Impact Funding Evidence Map (final draft, October 2026). Public: https://github.com/mikemetagov/bfi-evidence-map-pilot/blob/main/docs/outputs/01_Design/gsr_purpose_and_pilot_summary/20261009_Purpose-and-Use-Memo_final-draft.pdf</w:t>
       </w:r>
     </w:p>
   </w:footnote>

</xml_diff>